<commit_message>
cv and spanner mallet updatw
</commit_message>
<xml_diff>
--- a/downloads/cvs/DOCX/Arron Ware CV Teaching Assistant.docx
+++ b/downloads/cvs/DOCX/Arron Ware CV Teaching Assistant.docx
@@ -53,7 +53,6 @@
           <w:sz w:val="24"/>
         </w:rPr>
       </w:pPr>
-      <w:bookmarkStart w:id="0" w:name="_Hlk204965623"/>
       <w:r>
         <w:rPr>
           <w:b w:val="false"/>
@@ -101,15 +100,29 @@
           <w:sz w:val="24"/>
         </w:rPr>
       </w:pPr>
-      <w:bookmarkStart w:id="1" w:name="_Hlk204965623"/>
+      <w:bookmarkStart w:id="0" w:name="_Hlk204965623"/>
       <w:r>
         <w:rPr>
           <w:b w:val="false"/>
           <w:sz w:val="24"/>
         </w:rPr>
-        <w:t xml:space="preserve">After volunteering in one of the British Heart Foundation’s busiest charity shops in the centre of Manchester, I have gained people skills that I believe make me perfect for this role. I worked the till at peak times, helped customers with their requests, and organised stock both on the shop floor and in the storeroom. I would always seek out a new task to accomplish to maintain productivity when I was waiting for new instructions, such as reorganising the stock on the shop floor or socialising with customers. </w:t>
-      </w:r>
-      <w:bookmarkEnd w:id="1"/>
+        <w:t>After volunteering in one of the British Heart Foundation’s busiest charity shops in the centre of Manchester, I have gained people skills that I believe make me perfect for th</w:t>
+      </w:r>
+      <w:r>
+        <w:rPr>
+          <w:b w:val="false"/>
+          <w:sz w:val="24"/>
+        </w:rPr>
+        <w:t>e</w:t>
+      </w:r>
+      <w:r>
+        <w:rPr>
+          <w:b w:val="false"/>
+          <w:sz w:val="24"/>
+        </w:rPr>
+        <w:t xml:space="preserve"> role. I worked the till at peak times, helped customers with their requests, and organised stock both on the shop floor and in the storeroom. I would always seek out a new task to accomplish to maintain productivity when I was waiting for new instructions, such as reorganising the stock on the shop floor or socialising with customers. </w:t>
+      </w:r>
+      <w:bookmarkEnd w:id="0"/>
     </w:p>
     <w:p>
       <w:pPr>
@@ -160,11 +173,36 @@
         <w:rPr/>
         <w:t xml:space="preserve"> </w:t>
       </w:r>
+    </w:p>
+    <w:p>
+      <w:pPr>
+        <w:pStyle w:val="Normal"/>
+        <w:tabs>
+          <w:tab w:val="clear" w:pos="720"/>
+          <w:tab w:val="center" w:pos="4192" w:leader="none"/>
+        </w:tabs>
+        <w:spacing w:lineRule="auto" w:line="259" w:before="0" w:after="0"/>
+        <w:ind w:hanging="360" w:left="345" w:right="0"/>
+        <w:rPr/>
+      </w:pPr>
       <w:r>
         <w:rPr>
           <w:b/>
         </w:rPr>
-        <w:t>Undergraduate Sound and Music Design (2:1)</w:t>
+        <w:tab/>
+        <w:tab/>
+      </w:r>
+      <w:r>
+        <w:rPr>
+          <w:b/>
+        </w:rPr>
+        <w:t>(BA) Music &amp; Sound Design</w:t>
+      </w:r>
+      <w:r>
+        <w:rPr>
+          <w:b/>
+        </w:rPr>
+        <w:t xml:space="preserve"> (2:1)</w:t>
       </w:r>
     </w:p>
     <w:p>
@@ -178,7 +216,6 @@
         <w:ind w:hanging="360" w:left="705" w:right="0"/>
         <w:rPr/>
       </w:pPr>
-      <w:bookmarkStart w:id="2" w:name="_Hlk204964326"/>
       <w:r>
         <w:rPr/>
         <w:t>Created original pieces to be performed as a group, which developed my teamworking skills when working with people of different backgrounds and skillsets.</w:t>
@@ -207,32 +244,13 @@
           <w:ilvl w:val="0"/>
           <w:numId w:val="1"/>
         </w:numPr>
+        <w:spacing w:before="0" w:after="0"/>
         <w:ind w:hanging="360" w:left="705" w:right="0"/>
         <w:rPr/>
       </w:pPr>
-      <w:bookmarkStart w:id="3" w:name="_Hlk204964326"/>
-      <w:r>
-        <w:rPr/>
-        <w:t xml:space="preserve">Created a website using </w:t>
-      </w:r>
-      <w:bookmarkEnd w:id="3"/>
-      <w:r>
-        <w:rPr/>
-        <w:t>HTML which reflects my personal branding. (</w:t>
-      </w:r>
-      <w:hyperlink r:id="rId2">
-        <w:r>
-          <w:rPr>
-            <w:rStyle w:val="ListLabel46"/>
-            <w:color w:val="0563C1"/>
-            <w:u w:val="single" w:color="0563C1"/>
-          </w:rPr>
-          <w:t>arronware.com</w:t>
-        </w:r>
-      </w:hyperlink>
-      <w:r>
-        <w:rPr/>
-        <w:t>)</w:t>
+      <w:r>
+        <w:rPr/>
+        <w:t>Enhanced my ability to write, punctuate and structure essays with well professional referencing</w:t>
       </w:r>
     </w:p>
     <w:p>
@@ -278,7 +296,6 @@
         <w:ind w:hanging="360" w:left="705" w:right="0"/>
         <w:rPr/>
       </w:pPr>
-      <w:bookmarkStart w:id="4" w:name="_Hlk204967097"/>
       <w:r>
         <w:rPr/>
         <w:t>BTEC: Level 1/Level 2 Information and Creative Technology (Double Distinction*)</w:t>
@@ -295,12 +312,12 @@
         <w:ind w:hanging="360" w:left="705" w:right="0"/>
         <w:rPr/>
       </w:pPr>
-      <w:bookmarkStart w:id="5" w:name="_Hlk204967097"/>
+      <w:bookmarkStart w:id="1" w:name="_Hlk204967097"/>
       <w:r>
         <w:rPr/>
         <w:t>T Level: Digital Production, Design and Development (Merit)</w:t>
       </w:r>
-      <w:bookmarkEnd w:id="5"/>
+      <w:bookmarkEnd w:id="1"/>
     </w:p>
     <w:p>
       <w:pPr>
@@ -406,18 +423,13 @@
         <w:pStyle w:val="Normal"/>
         <w:spacing w:lineRule="auto" w:line="259" w:before="0" w:afterAutospacing="0" w:after="0"/>
         <w:ind w:hanging="10" w:left="-5" w:right="0"/>
-        <w:rPr/>
-      </w:pPr>
-      <w:r>
-        <w:rPr/>
-        <w:t>6/25–Present</w:t>
-      </w:r>
-      <w:r>
         <w:rPr>
           <w:b/>
           <w:bCs/>
         </w:rPr>
-        <w:t xml:space="preserve">  Unemployed/Seeking Role</w:t>
+      </w:pPr>
+      <w:r>
+        <w:rPr/>
       </w:r>
     </w:p>
     <w:p>
@@ -426,37 +438,69 @@
         <w:spacing w:lineRule="auto" w:line="259" w:before="0" w:afterAutospacing="0" w:after="0"/>
         <w:ind w:hanging="10" w:left="-5" w:right="0"/>
         <w:rPr>
-          <w:b/>
-          <w:bCs/>
-        </w:rPr>
-      </w:pPr>
-      <w:r>
-        <w:rPr>
-          <w:b/>
-          <w:bCs/>
-        </w:rPr>
-      </w:r>
-    </w:p>
-    <w:p>
-      <w:pPr>
-        <w:pStyle w:val="Normal"/>
-        <w:spacing w:lineRule="auto" w:line="259" w:before="0" w:after="142"/>
-        <w:ind w:hanging="10" w:left="-5" w:right="0"/>
-        <w:rPr>
-          <w:b/>
-          <w:bCs/>
-        </w:rPr>
-      </w:pPr>
-      <w:r>
-        <w:rPr/>
-        <w:t>09/25</w:t>
-      </w:r>
-      <w:r>
-        <w:rPr>
-          <w:b/>
-          <w:bCs/>
-        </w:rPr>
-        <w:t xml:space="preserve">  </w:t>
+          <w:b w:val="false"/>
+          <w:bCs w:val="false"/>
+        </w:rPr>
+      </w:pPr>
+      <w:r>
+        <w:rPr>
+          <w:rFonts w:eastAsia="system-ui" w:cs="system-ui" w:ascii="system-ui" w:hAnsi="system-ui"/>
+          <w:b w:val="false"/>
+          <w:bCs w:val="false"/>
+          <w:i w:val="false"/>
+          <w:iCs w:val="false"/>
+          <w:caps w:val="false"/>
+          <w:smallCaps w:val="false"/>
+          <w:sz w:val="24"/>
+          <w:szCs w:val="24"/>
+          <w:lang w:val="en-GB"/>
+        </w:rPr>
+        <w:t>1</w:t>
+      </w:r>
+      <w:r>
+        <w:rPr>
+          <w:rFonts w:eastAsia="system-ui" w:cs="system-ui" w:ascii="system-ui" w:hAnsi="system-ui"/>
+          <w:b w:val="false"/>
+          <w:bCs w:val="false"/>
+          <w:i w:val="false"/>
+          <w:iCs w:val="false"/>
+          <w:caps w:val="false"/>
+          <w:smallCaps w:val="false"/>
+          <w:sz w:val="24"/>
+          <w:szCs w:val="24"/>
+          <w:lang w:val="en-GB"/>
+        </w:rPr>
+        <w:t>/2</w:t>
+      </w:r>
+      <w:r>
+        <w:rPr>
+          <w:rFonts w:eastAsia="system-ui" w:cs="system-ui" w:ascii="system-ui" w:hAnsi="system-ui"/>
+          <w:b w:val="false"/>
+          <w:bCs w:val="false"/>
+          <w:i w:val="false"/>
+          <w:iCs w:val="false"/>
+          <w:caps w:val="false"/>
+          <w:smallCaps w:val="false"/>
+          <w:sz w:val="24"/>
+          <w:szCs w:val="24"/>
+          <w:lang w:val="en-GB"/>
+        </w:rPr>
+        <w:t>6</w:t>
+      </w:r>
+      <w:r>
+        <w:rPr>
+          <w:rFonts w:eastAsia="system-ui" w:cs="system-ui" w:ascii="system-ui" w:hAnsi="system-ui"/>
+          <w:b w:val="false"/>
+          <w:bCs w:val="false"/>
+          <w:i w:val="false"/>
+          <w:iCs w:val="false"/>
+          <w:caps w:val="false"/>
+          <w:smallCaps w:val="false"/>
+          <w:sz w:val="24"/>
+          <w:szCs w:val="24"/>
+          <w:lang w:val="en-GB"/>
+        </w:rPr>
+        <w:t xml:space="preserve">–Present  </w:t>
       </w:r>
       <w:r>
         <w:rPr>
@@ -471,7 +515,7 @@
           <w:szCs w:val="24"/>
           <w:lang w:val="en-GB"/>
         </w:rPr>
-        <w:t>Safeguarding &amp; Teaching Assistant Essentials With SEN – Connex Education</w:t>
+        <w:t>Supply Teaching Assistant (New Directions, Supply Pool)</w:t>
       </w:r>
     </w:p>
     <w:p>
@@ -486,8 +530,11 @@
         <w:rPr/>
       </w:pPr>
       <w:r>
-        <w:rPr/>
-        <w:t>During this course, I analysed previous events where safeguarding had failed and how it could have been prevented. Alongside this, I discovered further ways to help SEN children whilst ensuring that they remain independent. I also completed units dedicated to diversity and health and safety.</w:t>
+        <w:rPr>
+          <w:b w:val="false"/>
+          <w:bCs w:val="false"/>
+        </w:rPr>
+        <w:t>Working primarily around Northwich to provide specialised support to students with SEN requirements. Whilst thoroughly enjoying my time in these schools, I struggled due to the noise levels present in these environments so I would like to pursue mainstream Secondary and Primary schools.</w:t>
       </w:r>
     </w:p>
     <w:p>
@@ -495,18 +542,36 @@
         <w:pStyle w:val="Normal"/>
         <w:spacing w:lineRule="auto" w:line="259" w:before="0" w:after="142"/>
         <w:ind w:hanging="10" w:left="-5" w:right="0"/>
-        <w:rPr/>
-      </w:pPr>
-      <w:r>
-        <w:rPr/>
-        <w:t>11/24–6/25</w:t>
-      </w:r>
-      <w:r>
         <w:rPr>
           <w:b/>
           <w:bCs/>
         </w:rPr>
-        <w:t xml:space="preserve">  Retail Cashier - British Heart Foundation, Manchester Piccadilly</w:t>
+      </w:pPr>
+      <w:r>
+        <w:rPr/>
+        <w:t>09/25</w:t>
+      </w:r>
+      <w:r>
+        <w:rPr>
+          <w:b/>
+          <w:bCs/>
+        </w:rPr>
+        <w:t xml:space="preserve">  </w:t>
+      </w:r>
+      <w:r>
+        <w:rPr>
+          <w:rFonts w:eastAsia="system-ui" w:cs="system-ui" w:ascii="system-ui" w:hAnsi="system-ui"/>
+          <w:b/>
+          <w:bCs/>
+          <w:i w:val="false"/>
+          <w:iCs w:val="false"/>
+          <w:caps w:val="false"/>
+          <w:smallCaps w:val="false"/>
+          <w:sz w:val="24"/>
+          <w:szCs w:val="24"/>
+          <w:lang w:val="en-GB"/>
+        </w:rPr>
+        <w:t>Safeguarding &amp; Teaching Assistant Essentials With SEN – Connex Education</w:t>
       </w:r>
     </w:p>
     <w:p>
@@ -522,7 +587,7 @@
       </w:pPr>
       <w:r>
         <w:rPr/>
-        <w:t>I learned vital customer service skills whilst working the till and standing by the door to greet customers. I also frequently worked below the shop floor organising stock and preparing them to be put on display. I enjoyed meeting the different people who walked through the door of the shop each day, as I am a sociable person.</w:t>
+        <w:t>During this course, I analysed previous events where safeguarding had failed and how it could have been prevented. Alongside this, I discovered further ways to help SEN children whilst ensuring that they remain independent. I also completed units dedicated to diversity and health and safety.</w:t>
       </w:r>
     </w:p>
     <w:p>
@@ -534,24 +599,14 @@
       </w:pPr>
       <w:r>
         <w:rPr/>
-        <w:t>10/21</w:t>
-      </w:r>
-      <w:bookmarkStart w:id="6" w:name="_Hlk204967339"/>
-      <w:r>
-        <w:rPr/>
-        <w:t>–</w:t>
-      </w:r>
-      <w:bookmarkEnd w:id="6"/>
-      <w:r>
-        <w:rPr/>
-        <w:t>03/22</w:t>
+        <w:t>11/24–6/25</w:t>
       </w:r>
       <w:r>
         <w:rPr>
           <w:b/>
           <w:bCs/>
         </w:rPr>
-        <w:t xml:space="preserve">  Web Designer - Boysen B</w:t>
+        <w:t xml:space="preserve">  Retail Cashier - British Heart Foundation, Manchester Piccadilly</w:t>
       </w:r>
     </w:p>
     <w:p>
@@ -561,13 +616,16 @@
           <w:ilvl w:val="0"/>
           <w:numId w:val="2"/>
         </w:numPr>
-        <w:spacing w:lineRule="auto" w:line="259" w:before="0" w:after="142"/>
-        <w:ind w:hanging="370" w:left="705" w:right="0"/>
-        <w:rPr/>
-      </w:pPr>
-      <w:r>
-        <w:rPr/>
-        <w:t>I was tasked with producing websites that aimed to educate on various impacts of climate change. This developed my teamworking skills in a web development context, as the impact calculations I undertook utilised many factors which required group communication.</w:t>
+        <w:spacing w:before="0" w:after="266"/>
+        <w:ind w:hanging="360" w:left="705" w:right="0"/>
+        <w:rPr>
+          <w:b/>
+          <w:bCs/>
+        </w:rPr>
+      </w:pPr>
+      <w:r>
+        <w:rPr/>
+        <w:t>I learned vital customer service skills whilst working the till and standing by the door to greet customers. I also frequently worked below the shop floor organising stock and preparing them to be put on display. I enjoyed meeting the different people who walked through the door of the shop each day, as I am a sociable person.</w:t>
       </w:r>
     </w:p>
     <w:p>
@@ -678,65 +736,6 @@
       </w:pPr>
       <w:r>
         <w:rPr/>
-        <w:t>ADDITIONAL IT SKILLS</w:t>
-        <w:tab/>
-        <w:t xml:space="preserve"> </w:t>
-      </w:r>
-    </w:p>
-    <w:p>
-      <w:pPr>
-        <w:pStyle w:val="Normal"/>
-        <w:numPr>
-          <w:ilvl w:val="0"/>
-          <w:numId w:val="4"/>
-        </w:numPr>
-        <w:ind w:hanging="360" w:left="705" w:right="0"/>
-        <w:rPr/>
-      </w:pPr>
-      <w:r>
-        <w:rPr/>
-        <w:t>Have basic proficiency in Python.</w:t>
-      </w:r>
-    </w:p>
-    <w:p>
-      <w:pPr>
-        <w:pStyle w:val="Normal"/>
-        <w:numPr>
-          <w:ilvl w:val="0"/>
-          <w:numId w:val="4"/>
-        </w:numPr>
-        <w:ind w:hanging="360" w:left="705" w:right="0"/>
-        <w:rPr/>
-      </w:pPr>
-      <w:r>
-        <w:rPr/>
-        <w:t>I am skilled at designing complex websites using HTML, PHP, SQL and CSS.</w:t>
-      </w:r>
-    </w:p>
-    <w:p>
-      <w:pPr>
-        <w:pStyle w:val="Normal"/>
-        <w:numPr>
-          <w:ilvl w:val="0"/>
-          <w:numId w:val="4"/>
-        </w:numPr>
-        <w:spacing w:lineRule="auto" w:line="247" w:before="0" w:after="319"/>
-        <w:ind w:hanging="360" w:left="705" w:right="0"/>
-        <w:rPr/>
-      </w:pPr>
-      <w:r>
-        <w:rPr/>
-        <w:t>I am well-experienced in graphic design using software such as Adobe Photoshop and GIMP.</w:t>
-      </w:r>
-    </w:p>
-    <w:p>
-      <w:pPr>
-        <w:pStyle w:val="Heading1"/>
-        <w:ind w:hanging="10" w:left="-5"/>
-        <w:rPr/>
-      </w:pPr>
-      <w:r>
-        <w:rPr/>
         <w:t>INTERESTS AND ACTIVITIES</w:t>
       </w:r>
     </w:p>
@@ -754,304 +753,24 @@
     </w:p>
     <w:p>
       <w:pPr>
-        <w:pStyle w:val="Heading1"/>
-        <w:ind w:hanging="10" w:left="-5"/>
-        <w:rPr/>
-      </w:pPr>
-      <w:r>
-        <w:rPr/>
-        <w:t>CHARACTER REFERENCES</w:t>
-      </w:r>
-    </w:p>
-    <w:p>
-      <w:pPr>
-        <w:pStyle w:val="ListParagraph"/>
-        <w:numPr>
-          <w:ilvl w:val="0"/>
-          <w:numId w:val="5"/>
-        </w:numPr>
-        <w:spacing w:before="0" w:after="110"/>
-        <w:ind w:hanging="360" w:left="720" w:right="0"/>
-        <w:contextualSpacing/>
-        <w:rPr/>
-      </w:pPr>
-      <w:r>
-        <w:rPr/>
-        <w:t xml:space="preserve">Shannon Norris – Programme Leader for Computing at Grimsby Institute of Further &amp; Higher Education. </w:t>
-      </w:r>
-    </w:p>
-    <w:p>
-      <w:pPr>
-        <w:pStyle w:val="ListParagraph"/>
-        <w:numPr>
-          <w:ilvl w:val="0"/>
-          <w:numId w:val="0"/>
-        </w:numPr>
-        <w:spacing w:before="0" w:after="110"/>
-        <w:ind w:hanging="0" w:left="720" w:right="0"/>
-        <w:contextualSpacing/>
-        <w:rPr/>
-      </w:pPr>
-      <w:r>
-        <w:rPr/>
-        <w:t xml:space="preserve">Email Address: </w:t>
-      </w:r>
-      <w:hyperlink r:id="rId3">
-        <w:r>
-          <w:rPr>
-            <w:rStyle w:val="Hyperlink"/>
-          </w:rPr>
-          <w:t>norriss@grimsby.ac.uk</w:t>
-        </w:r>
-      </w:hyperlink>
-    </w:p>
-    <w:p>
-      <w:pPr>
-        <w:pStyle w:val="ListParagraph"/>
-        <w:numPr>
-          <w:ilvl w:val="0"/>
-          <w:numId w:val="0"/>
-        </w:numPr>
-        <w:spacing w:before="0" w:after="110"/>
-        <w:ind w:hanging="0" w:left="720" w:right="0"/>
-        <w:contextualSpacing/>
-        <w:rPr>
-          <w:rStyle w:val="Hyperlink"/>
-        </w:rPr>
-      </w:pPr>
-      <w:r>
-        <w:rPr/>
-      </w:r>
-    </w:p>
-    <w:p>
-      <w:pPr>
-        <w:pStyle w:val="ListParagraph"/>
-        <w:numPr>
-          <w:ilvl w:val="0"/>
-          <w:numId w:val="5"/>
-        </w:numPr>
-        <w:spacing w:before="0" w:after="108"/>
-        <w:ind w:hanging="360" w:left="720" w:right="0"/>
-        <w:contextualSpacing/>
-        <w:rPr/>
-      </w:pPr>
-      <w:r>
-        <w:rPr/>
-        <w:t xml:space="preserve">Joanna Finley – Manager for British Heart Foundation, Manchester Piccadilly. </w:t>
-      </w:r>
-    </w:p>
-    <w:p>
-      <w:pPr>
-        <w:pStyle w:val="ListParagraph"/>
-        <w:numPr>
-          <w:ilvl w:val="0"/>
-          <w:numId w:val="0"/>
-        </w:numPr>
-        <w:spacing w:before="0" w:after="108"/>
-        <w:ind w:hanging="0" w:left="720" w:right="0"/>
-        <w:contextualSpacing/>
-        <w:rPr/>
-      </w:pPr>
-      <w:r>
-        <w:rPr/>
-        <w:t xml:space="preserve">Email Address: </w:t>
-      </w:r>
-      <w:hyperlink r:id="rId5">
-        <w:r>
-          <w:rPr>
-            <w:rStyle w:val="Hyperlink"/>
-            <w:color w:val="0563C1"/>
-            <w:u w:val="single" w:color="0563C1"/>
-          </w:rPr>
-          <w:t>M36@bhf.org.uk</w:t>
-        </w:r>
-      </w:hyperlink>
-    </w:p>
-    <w:p>
-      <w:pPr>
-        <w:pStyle w:val="ListParagraph"/>
-        <w:numPr>
-          <w:ilvl w:val="0"/>
-          <w:numId w:val="0"/>
-        </w:numPr>
-        <w:spacing w:before="0" w:after="108"/>
-        <w:ind w:hanging="0" w:left="720" w:right="0"/>
-        <w:contextualSpacing/>
-        <w:rPr>
-          <w:color w:val="0563C1"/>
-          <w:u w:val="single" w:color="0563C1"/>
-        </w:rPr>
-      </w:pPr>
-      <w:r>
-        <w:rPr/>
-      </w:r>
-    </w:p>
-    <w:p>
-      <w:pPr>
-        <w:pStyle w:val="ListParagraph"/>
-        <w:numPr>
-          <w:ilvl w:val="0"/>
-          <w:numId w:val="5"/>
-        </w:numPr>
-        <w:spacing w:before="0" w:after="108"/>
-        <w:ind w:hanging="360" w:left="720" w:right="0"/>
-        <w:contextualSpacing/>
-        <w:rPr/>
-      </w:pPr>
-      <w:r>
-        <w:rPr/>
-        <w:t xml:space="preserve">Neil Bruce – Music &amp; Sound Lecturer at Manchester Metropolitan University. </w:t>
-      </w:r>
-    </w:p>
-    <w:p>
-      <w:pPr>
-        <w:pStyle w:val="ListParagraph"/>
-        <w:numPr>
-          <w:ilvl w:val="0"/>
-          <w:numId w:val="0"/>
-        </w:numPr>
-        <w:spacing w:before="0" w:after="108"/>
-        <w:ind w:hanging="0" w:left="720" w:right="0"/>
-        <w:contextualSpacing/>
-        <w:rPr/>
-      </w:pPr>
-      <w:r>
-        <w:rPr/>
-        <w:t xml:space="preserve">Email: </w:t>
-      </w:r>
-      <w:hyperlink r:id="rId7">
-        <w:r>
-          <w:rPr>
-            <w:rStyle w:val="Hyperlink"/>
-            <w:rFonts w:ascii="Aptos;Arial;Helvetica;sans-serif" w:hAnsi="Aptos;Arial;Helvetica;sans-serif"/>
-            <w:color w:val="1E90FF"/>
-            <w:sz w:val="24"/>
-          </w:rPr>
-          <w:t>n.bruce@mmu.ac.uk</w:t>
-        </w:r>
-      </w:hyperlink>
-    </w:p>
-    <w:p>
-      <w:pPr>
-        <w:pStyle w:val="ListParagraph"/>
-        <w:numPr>
-          <w:ilvl w:val="0"/>
-          <w:numId w:val="0"/>
-        </w:numPr>
-        <w:spacing w:before="0" w:after="108"/>
-        <w:ind w:hanging="0" w:left="720" w:right="0"/>
-        <w:contextualSpacing/>
-        <w:rPr>
-          <w:rFonts w:ascii="Aptos;Arial;Helvetica;sans-serif" w:hAnsi="Aptos;Arial;Helvetica;sans-serif"/>
-          <w:color w:val="1E90FF"/>
-          <w:sz w:val="24"/>
-        </w:rPr>
-      </w:pPr>
-      <w:r>
-        <w:rPr/>
-      </w:r>
-    </w:p>
-    <w:p>
-      <w:pPr>
-        <w:pStyle w:val="ListParagraph"/>
-        <w:numPr>
-          <w:ilvl w:val="0"/>
-          <w:numId w:val="5"/>
-        </w:numPr>
-        <w:spacing w:before="0" w:after="108"/>
-        <w:ind w:hanging="360" w:left="720" w:right="0"/>
-        <w:contextualSpacing/>
-        <w:rPr/>
-      </w:pPr>
-      <w:r>
-        <w:rPr/>
-        <w:t xml:space="preserve">Chris Gladwin – Music &amp; Sound Lecturer at Manchester Metropolitan University. </w:t>
-      </w:r>
-    </w:p>
-    <w:p>
-      <w:pPr>
-        <w:pStyle w:val="ListParagraph"/>
-        <w:numPr>
-          <w:ilvl w:val="0"/>
-          <w:numId w:val="0"/>
-        </w:numPr>
-        <w:spacing w:before="0" w:after="108"/>
-        <w:ind w:hanging="0" w:left="720" w:right="0"/>
-        <w:contextualSpacing/>
-        <w:rPr/>
-      </w:pPr>
-      <w:r>
-        <w:rPr/>
-        <w:t xml:space="preserve">Email: </w:t>
-      </w:r>
-      <w:hyperlink r:id="rId8">
-        <w:r>
-          <w:rPr>
-            <w:rStyle w:val="Hyperlink"/>
-            <w:rFonts w:ascii="Aptos;sans-serif" w:hAnsi="Aptos;sans-serif"/>
-            <w:b w:val="false"/>
-            <w:i w:val="false"/>
-            <w:caps w:val="false"/>
-            <w:smallCaps w:val="false"/>
-            <w:color w:val="467886"/>
-            <w:spacing w:val="0"/>
-            <w:sz w:val="24"/>
-            <w:u w:val="single"/>
-          </w:rPr>
-          <w:t>c.gladwin@mmu.ac.uk</w:t>
-        </w:r>
-      </w:hyperlink>
-    </w:p>
-    <w:p>
-      <w:pPr>
-        <w:pStyle w:val="ListParagraph"/>
-        <w:numPr>
-          <w:ilvl w:val="0"/>
-          <w:numId w:val="0"/>
-        </w:numPr>
-        <w:spacing w:before="0" w:after="108"/>
-        <w:ind w:hanging="0" w:left="720" w:right="0"/>
-        <w:contextualSpacing/>
-        <w:rPr/>
-      </w:pPr>
-      <w:r>
-        <w:rPr/>
-        <w:t xml:space="preserve">Phone: </w:t>
-      </w:r>
-      <w:hyperlink r:id="rId9" w:tgtFrame="_blank">
-        <w:r>
-          <w:rPr>
-            <w:rStyle w:val="Hyperlink"/>
-            <w:rFonts w:ascii="Aptos;sans-serif" w:hAnsi="Aptos;sans-serif"/>
-            <w:b w:val="false"/>
-            <w:i w:val="false"/>
-            <w:caps w:val="false"/>
-            <w:smallCaps w:val="false"/>
-            <w:spacing w:val="0"/>
-            <w:sz w:val="24"/>
-          </w:rPr>
-          <w:t>+44 (0)161 247 2000</w:t>
-        </w:r>
-      </w:hyperlink>
-    </w:p>
-    <w:p>
-      <w:pPr>
-        <w:pStyle w:val="ListParagraph"/>
-        <w:numPr>
-          <w:ilvl w:val="0"/>
-          <w:numId w:val="0"/>
-        </w:numPr>
-        <w:spacing w:before="0" w:after="108"/>
-        <w:ind w:hanging="0" w:left="720" w:right="0"/>
-        <w:contextualSpacing/>
-        <w:rPr>
-          <w:rFonts w:ascii="Aptos;Arial;Helvetica;sans-serif" w:hAnsi="Aptos;Arial;Helvetica;sans-serif"/>
-          <w:color w:val="1E90FF"/>
-          <w:sz w:val="24"/>
-        </w:rPr>
-      </w:pPr>
-      <w:r>
-        <w:rPr/>
+        <w:pStyle w:val="Normal"/>
+        <w:spacing w:before="0" w:after="268"/>
+        <w:ind w:hanging="0" w:left="0" w:right="0"/>
+        <w:rPr/>
+      </w:pPr>
+      <w:r>
+        <w:rPr/>
+      </w:r>
+    </w:p>
+    <w:p>
+      <w:pPr>
+        <w:pStyle w:val="Normal"/>
+        <w:spacing w:lineRule="auto" w:line="259" w:before="0" w:after="96"/>
+        <w:rPr/>
+      </w:pPr>
+      <w:r>
+        <w:rPr/>
+        <w:t>References available on request</w:t>
       </w:r>
     </w:p>
     <w:sectPr>
@@ -1807,399 +1526,6 @@
   <w:abstractNum w:abstractNumId="4">
     <w:lvl w:ilvl="0">
       <w:start w:val="1"/>
-      <w:numFmt w:val="bullet"/>
-      <w:lvlText w:val="•"/>
-      <w:lvlJc w:val="left"/>
-      <w:pPr>
-        <w:tabs>
-          <w:tab w:val="num" w:pos="0"/>
-        </w:tabs>
-        <w:ind w:left="705" w:hanging="0"/>
-      </w:pPr>
-      <w:rPr>
-        <w:rFonts w:ascii="Arial" w:hAnsi="Arial" w:cs="Arial" w:hint="default"/>
-        <w:dstrike w:val="false"/>
-        <w:strike w:val="false"/>
-        <w:vertAlign w:val="baseline"/>
-        <w:position w:val="0"/>
-        <w:sz w:val="24"/>
-        <w:sz w:val="24"/>
-        <w:i w:val="false"/>
-        <w:u w:val="none" w:color="000000"/>
-        <w:b w:val="false"/>
-        <w:shd w:fill="auto" w:val="clear"/>
-        <w:szCs w:val="24"/>
-        <w:color w:val="000000"/>
-      </w:rPr>
-    </w:lvl>
-    <w:lvl w:ilvl="1">
-      <w:start w:val="1"/>
-      <w:numFmt w:val="bullet"/>
-      <w:lvlText w:val="o"/>
-      <w:lvlJc w:val="left"/>
-      <w:pPr>
-        <w:tabs>
-          <w:tab w:val="num" w:pos="0"/>
-        </w:tabs>
-        <w:ind w:left="1440" w:hanging="0"/>
-      </w:pPr>
-      <w:rPr>
-        <w:rFonts w:ascii="Calibri" w:hAnsi="Calibri" w:cs="Calibri" w:hint="default"/>
-        <w:dstrike w:val="false"/>
-        <w:strike w:val="false"/>
-        <w:vertAlign w:val="baseline"/>
-        <w:position w:val="0"/>
-        <w:sz w:val="24"/>
-        <w:sz w:val="24"/>
-        <w:i w:val="false"/>
-        <w:u w:val="none" w:color="000000"/>
-        <w:b w:val="false"/>
-        <w:shd w:fill="auto" w:val="clear"/>
-        <w:szCs w:val="24"/>
-        <w:color w:val="000000"/>
-      </w:rPr>
-    </w:lvl>
-    <w:lvl w:ilvl="2">
-      <w:start w:val="1"/>
-      <w:numFmt w:val="bullet"/>
-      <w:lvlText w:val="▪"/>
-      <w:lvlJc w:val="left"/>
-      <w:pPr>
-        <w:tabs>
-          <w:tab w:val="num" w:pos="0"/>
-        </w:tabs>
-        <w:ind w:left="2160" w:hanging="0"/>
-      </w:pPr>
-      <w:rPr>
-        <w:rFonts w:ascii="Calibri" w:hAnsi="Calibri" w:cs="Calibri" w:hint="default"/>
-        <w:dstrike w:val="false"/>
-        <w:strike w:val="false"/>
-        <w:vertAlign w:val="baseline"/>
-        <w:position w:val="0"/>
-        <w:sz w:val="24"/>
-        <w:sz w:val="24"/>
-        <w:i w:val="false"/>
-        <w:u w:val="none" w:color="000000"/>
-        <w:b w:val="false"/>
-        <w:shd w:fill="auto" w:val="clear"/>
-        <w:szCs w:val="24"/>
-        <w:color w:val="000000"/>
-      </w:rPr>
-    </w:lvl>
-    <w:lvl w:ilvl="3">
-      <w:start w:val="1"/>
-      <w:numFmt w:val="bullet"/>
-      <w:lvlText w:val="•"/>
-      <w:lvlJc w:val="left"/>
-      <w:pPr>
-        <w:tabs>
-          <w:tab w:val="num" w:pos="0"/>
-        </w:tabs>
-        <w:ind w:left="2880" w:hanging="0"/>
-      </w:pPr>
-      <w:rPr>
-        <w:rFonts w:ascii="Calibri" w:hAnsi="Calibri" w:cs="Calibri" w:hint="default"/>
-        <w:dstrike w:val="false"/>
-        <w:strike w:val="false"/>
-        <w:vertAlign w:val="baseline"/>
-        <w:position w:val="0"/>
-        <w:sz w:val="24"/>
-        <w:sz w:val="24"/>
-        <w:i w:val="false"/>
-        <w:u w:val="none" w:color="000000"/>
-        <w:b w:val="false"/>
-        <w:shd w:fill="auto" w:val="clear"/>
-        <w:szCs w:val="24"/>
-        <w:color w:val="000000"/>
-      </w:rPr>
-    </w:lvl>
-    <w:lvl w:ilvl="4">
-      <w:start w:val="1"/>
-      <w:numFmt w:val="bullet"/>
-      <w:lvlText w:val="o"/>
-      <w:lvlJc w:val="left"/>
-      <w:pPr>
-        <w:tabs>
-          <w:tab w:val="num" w:pos="0"/>
-        </w:tabs>
-        <w:ind w:left="3600" w:hanging="0"/>
-      </w:pPr>
-      <w:rPr>
-        <w:rFonts w:ascii="Calibri" w:hAnsi="Calibri" w:cs="Calibri" w:hint="default"/>
-        <w:dstrike w:val="false"/>
-        <w:strike w:val="false"/>
-        <w:vertAlign w:val="baseline"/>
-        <w:position w:val="0"/>
-        <w:sz w:val="24"/>
-        <w:sz w:val="24"/>
-        <w:i w:val="false"/>
-        <w:u w:val="none" w:color="000000"/>
-        <w:b w:val="false"/>
-        <w:shd w:fill="auto" w:val="clear"/>
-        <w:szCs w:val="24"/>
-        <w:color w:val="000000"/>
-      </w:rPr>
-    </w:lvl>
-    <w:lvl w:ilvl="5">
-      <w:start w:val="1"/>
-      <w:numFmt w:val="bullet"/>
-      <w:lvlText w:val="▪"/>
-      <w:lvlJc w:val="left"/>
-      <w:pPr>
-        <w:tabs>
-          <w:tab w:val="num" w:pos="0"/>
-        </w:tabs>
-        <w:ind w:left="4320" w:hanging="0"/>
-      </w:pPr>
-      <w:rPr>
-        <w:rFonts w:ascii="Calibri" w:hAnsi="Calibri" w:cs="Calibri" w:hint="default"/>
-        <w:dstrike w:val="false"/>
-        <w:strike w:val="false"/>
-        <w:vertAlign w:val="baseline"/>
-        <w:position w:val="0"/>
-        <w:sz w:val="24"/>
-        <w:sz w:val="24"/>
-        <w:i w:val="false"/>
-        <w:u w:val="none" w:color="000000"/>
-        <w:b w:val="false"/>
-        <w:shd w:fill="auto" w:val="clear"/>
-        <w:szCs w:val="24"/>
-        <w:color w:val="000000"/>
-      </w:rPr>
-    </w:lvl>
-    <w:lvl w:ilvl="6">
-      <w:start w:val="1"/>
-      <w:numFmt w:val="bullet"/>
-      <w:lvlText w:val="•"/>
-      <w:lvlJc w:val="left"/>
-      <w:pPr>
-        <w:tabs>
-          <w:tab w:val="num" w:pos="0"/>
-        </w:tabs>
-        <w:ind w:left="5040" w:hanging="0"/>
-      </w:pPr>
-      <w:rPr>
-        <w:rFonts w:ascii="Calibri" w:hAnsi="Calibri" w:cs="Calibri" w:hint="default"/>
-        <w:dstrike w:val="false"/>
-        <w:strike w:val="false"/>
-        <w:vertAlign w:val="baseline"/>
-        <w:position w:val="0"/>
-        <w:sz w:val="24"/>
-        <w:sz w:val="24"/>
-        <w:i w:val="false"/>
-        <w:u w:val="none" w:color="000000"/>
-        <w:b w:val="false"/>
-        <w:shd w:fill="auto" w:val="clear"/>
-        <w:szCs w:val="24"/>
-        <w:color w:val="000000"/>
-      </w:rPr>
-    </w:lvl>
-    <w:lvl w:ilvl="7">
-      <w:start w:val="1"/>
-      <w:numFmt w:val="bullet"/>
-      <w:lvlText w:val="o"/>
-      <w:lvlJc w:val="left"/>
-      <w:pPr>
-        <w:tabs>
-          <w:tab w:val="num" w:pos="0"/>
-        </w:tabs>
-        <w:ind w:left="5760" w:hanging="0"/>
-      </w:pPr>
-      <w:rPr>
-        <w:rFonts w:ascii="Calibri" w:hAnsi="Calibri" w:cs="Calibri" w:hint="default"/>
-        <w:dstrike w:val="false"/>
-        <w:strike w:val="false"/>
-        <w:vertAlign w:val="baseline"/>
-        <w:position w:val="0"/>
-        <w:sz w:val="24"/>
-        <w:sz w:val="24"/>
-        <w:i w:val="false"/>
-        <w:u w:val="none" w:color="000000"/>
-        <w:b w:val="false"/>
-        <w:shd w:fill="auto" w:val="clear"/>
-        <w:szCs w:val="24"/>
-        <w:color w:val="000000"/>
-      </w:rPr>
-    </w:lvl>
-    <w:lvl w:ilvl="8">
-      <w:start w:val="1"/>
-      <w:numFmt w:val="bullet"/>
-      <w:lvlText w:val="▪"/>
-      <w:lvlJc w:val="left"/>
-      <w:pPr>
-        <w:tabs>
-          <w:tab w:val="num" w:pos="0"/>
-        </w:tabs>
-        <w:ind w:left="6480" w:hanging="0"/>
-      </w:pPr>
-      <w:rPr>
-        <w:rFonts w:ascii="Calibri" w:hAnsi="Calibri" w:cs="Calibri" w:hint="default"/>
-        <w:dstrike w:val="false"/>
-        <w:strike w:val="false"/>
-        <w:vertAlign w:val="baseline"/>
-        <w:position w:val="0"/>
-        <w:sz w:val="24"/>
-        <w:sz w:val="24"/>
-        <w:i w:val="false"/>
-        <w:u w:val="none" w:color="000000"/>
-        <w:b w:val="false"/>
-        <w:shd w:fill="auto" w:val="clear"/>
-        <w:szCs w:val="24"/>
-        <w:color w:val="000000"/>
-      </w:rPr>
-    </w:lvl>
-  </w:abstractNum>
-  <w:abstractNum w:abstractNumId="5">
-    <w:lvl w:ilvl="0">
-      <w:start w:val="1"/>
-      <w:numFmt w:val="bullet"/>
-      <w:lvlText w:val="•"/>
-      <w:lvlJc w:val="left"/>
-      <w:pPr>
-        <w:tabs>
-          <w:tab w:val="num" w:pos="0"/>
-        </w:tabs>
-        <w:ind w:left="720" w:hanging="360"/>
-      </w:pPr>
-      <w:rPr>
-        <w:rFonts w:ascii="Arial" w:hAnsi="Arial" w:cs="Arial" w:hint="default"/>
-        <w:dstrike w:val="false"/>
-        <w:strike w:val="false"/>
-        <w:vertAlign w:val="baseline"/>
-        <w:position w:val="0"/>
-        <w:sz w:val="24"/>
-        <w:sz w:val="24"/>
-        <w:i w:val="false"/>
-        <w:u w:val="none" w:color="000000"/>
-        <w:b w:val="false"/>
-        <w:szCs w:val="24"/>
-        <w:color w:val="000000"/>
-      </w:rPr>
-    </w:lvl>
-    <w:lvl w:ilvl="1">
-      <w:start w:val="1"/>
-      <w:numFmt w:val="bullet"/>
-      <w:lvlText w:val="o"/>
-      <w:lvlJc w:val="left"/>
-      <w:pPr>
-        <w:tabs>
-          <w:tab w:val="num" w:pos="0"/>
-        </w:tabs>
-        <w:ind w:left="1440" w:hanging="360"/>
-      </w:pPr>
-      <w:rPr>
-        <w:rFonts w:ascii="Courier New" w:hAnsi="Courier New" w:cs="Courier New" w:hint="default"/>
-      </w:rPr>
-    </w:lvl>
-    <w:lvl w:ilvl="2">
-      <w:start w:val="1"/>
-      <w:numFmt w:val="bullet"/>
-      <w:lvlText w:val=""/>
-      <w:lvlJc w:val="left"/>
-      <w:pPr>
-        <w:tabs>
-          <w:tab w:val="num" w:pos="0"/>
-        </w:tabs>
-        <w:ind w:left="2160" w:hanging="360"/>
-      </w:pPr>
-      <w:rPr>
-        <w:rFonts w:ascii="Wingdings" w:hAnsi="Wingdings" w:cs="Wingdings" w:hint="default"/>
-      </w:rPr>
-    </w:lvl>
-    <w:lvl w:ilvl="3">
-      <w:start w:val="1"/>
-      <w:numFmt w:val="bullet"/>
-      <w:lvlText w:val=""/>
-      <w:lvlJc w:val="left"/>
-      <w:pPr>
-        <w:tabs>
-          <w:tab w:val="num" w:pos="0"/>
-        </w:tabs>
-        <w:ind w:left="2880" w:hanging="360"/>
-      </w:pPr>
-      <w:rPr>
-        <w:rFonts w:ascii="Symbol" w:hAnsi="Symbol" w:cs="Symbol" w:hint="default"/>
-      </w:rPr>
-    </w:lvl>
-    <w:lvl w:ilvl="4">
-      <w:start w:val="1"/>
-      <w:numFmt w:val="bullet"/>
-      <w:lvlText w:val="o"/>
-      <w:lvlJc w:val="left"/>
-      <w:pPr>
-        <w:tabs>
-          <w:tab w:val="num" w:pos="0"/>
-        </w:tabs>
-        <w:ind w:left="3600" w:hanging="360"/>
-      </w:pPr>
-      <w:rPr>
-        <w:rFonts w:ascii="Courier New" w:hAnsi="Courier New" w:cs="Courier New" w:hint="default"/>
-      </w:rPr>
-    </w:lvl>
-    <w:lvl w:ilvl="5">
-      <w:start w:val="1"/>
-      <w:numFmt w:val="bullet"/>
-      <w:lvlText w:val=""/>
-      <w:lvlJc w:val="left"/>
-      <w:pPr>
-        <w:tabs>
-          <w:tab w:val="num" w:pos="0"/>
-        </w:tabs>
-        <w:ind w:left="4320" w:hanging="360"/>
-      </w:pPr>
-      <w:rPr>
-        <w:rFonts w:ascii="Wingdings" w:hAnsi="Wingdings" w:cs="Wingdings" w:hint="default"/>
-      </w:rPr>
-    </w:lvl>
-    <w:lvl w:ilvl="6">
-      <w:start w:val="1"/>
-      <w:numFmt w:val="bullet"/>
-      <w:lvlText w:val=""/>
-      <w:lvlJc w:val="left"/>
-      <w:pPr>
-        <w:tabs>
-          <w:tab w:val="num" w:pos="0"/>
-        </w:tabs>
-        <w:ind w:left="5040" w:hanging="360"/>
-      </w:pPr>
-      <w:rPr>
-        <w:rFonts w:ascii="Symbol" w:hAnsi="Symbol" w:cs="Symbol" w:hint="default"/>
-      </w:rPr>
-    </w:lvl>
-    <w:lvl w:ilvl="7">
-      <w:start w:val="1"/>
-      <w:numFmt w:val="bullet"/>
-      <w:lvlText w:val="o"/>
-      <w:lvlJc w:val="left"/>
-      <w:pPr>
-        <w:tabs>
-          <w:tab w:val="num" w:pos="0"/>
-        </w:tabs>
-        <w:ind w:left="5760" w:hanging="360"/>
-      </w:pPr>
-      <w:rPr>
-        <w:rFonts w:ascii="Courier New" w:hAnsi="Courier New" w:cs="Courier New" w:hint="default"/>
-      </w:rPr>
-    </w:lvl>
-    <w:lvl w:ilvl="8">
-      <w:start w:val="1"/>
-      <w:numFmt w:val="bullet"/>
-      <w:lvlText w:val=""/>
-      <w:lvlJc w:val="left"/>
-      <w:pPr>
-        <w:tabs>
-          <w:tab w:val="num" w:pos="0"/>
-        </w:tabs>
-        <w:ind w:left="6480" w:hanging="360"/>
-      </w:pPr>
-      <w:rPr>
-        <w:rFonts w:ascii="Wingdings" w:hAnsi="Wingdings" w:cs="Wingdings" w:hint="default"/>
-      </w:rPr>
-    </w:lvl>
-  </w:abstractNum>
-  <w:abstractNum w:abstractNumId="6">
-    <w:lvl w:ilvl="0">
-      <w:start w:val="1"/>
       <w:numFmt w:val="none"/>
       <w:suff w:val="nothing"/>
       <w:lvlText w:val=""/>
@@ -2328,12 +1654,6 @@
   <w:num w:numId="4">
     <w:abstractNumId w:val="4"/>
   </w:num>
-  <w:num w:numId="5">
-    <w:abstractNumId w:val="5"/>
-  </w:num>
-  <w:num w:numId="6">
-    <w:abstractNumId w:val="6"/>
-  </w:num>
 </w:numbering>
 </file>
 
@@ -2342,7 +1662,7 @@
   <w:docDefaults>
     <w:rPrDefault>
       <w:rPr>
-        <w:rFonts w:ascii="Aptos" w:hAnsi="Aptos" w:eastAsia="游明朝" w:cs="Arial" w:asciiTheme="minorHAnsi" w:cstheme="minorBidi" w:eastAsiaTheme="minorEastAsia" w:hAnsiTheme="minorHAnsi"/>
+        <w:rFonts w:ascii="Aptos" w:hAnsi="Aptos" w:eastAsia="" w:cs="" w:asciiTheme="minorHAnsi" w:cstheme="minorBidi" w:eastAsiaTheme="minorEastAsia" w:hAnsiTheme="minorHAnsi"/>
         <w:kern w:val="2"/>
         <w:sz w:val="24"/>
         <w:szCs w:val="24"/>
@@ -2740,8 +2060,9 @@
     <w:rsid w:val="00195519"/>
     <w:pPr>
       <w:widowControl/>
+      <w:suppressAutoHyphens w:val="true"/>
       <w:bidi w:val="0"/>
-      <w:spacing w:lineRule="auto" w:line="249" w:before="0" w:after="5"/>
+      <w:spacing w:lineRule="auto" w:line="247" w:before="0" w:after="5"/>
       <w:ind w:hanging="370" w:left="3250" w:right="2862"/>
       <w:jc w:val="left"/>
     </w:pPr>
@@ -2764,6 +2085,7 @@
       <w:keepNext w:val="true"/>
       <w:keepLines/>
       <w:widowControl/>
+      <w:suppressAutoHyphens w:val="true"/>
       <w:bidi w:val="0"/>
       <w:spacing w:lineRule="auto" w:line="259" w:before="0" w:after="96"/>
       <w:ind w:hanging="10" w:left="10"/>
@@ -2891,6 +2213,28 @@
       <w:spacing w:before="0" w:after="5"/>
       <w:ind w:left="720"/>
       <w:contextualSpacing/>
+    </w:pPr>
+    <w:rPr/>
+  </w:style>
+  <w:style w:type="paragraph" w:styleId="HeaderandFooter">
+    <w:name w:val="Header and Footer"/>
+    <w:basedOn w:val="Normal"/>
+    <w:qFormat/>
+    <w:pPr>
+      <w:suppressLineNumbers/>
+      <w:tabs>
+        <w:tab w:val="clear" w:pos="720"/>
+        <w:tab w:val="center" w:pos="4980" w:leader="none"/>
+        <w:tab w:val="right" w:pos="9961" w:leader="none"/>
+      </w:tabs>
+    </w:pPr>
+    <w:rPr/>
+  </w:style>
+  <w:style w:type="paragraph" w:styleId="Footer">
+    <w:name w:val="Footer"/>
+    <w:basedOn w:val="HeaderandFooter"/>
+    <w:pPr>
+      <w:suppressLineNumbers/>
     </w:pPr>
     <w:rPr/>
   </w:style>

</xml_diff>